<commit_message>
Update pedagogical context: 1-on-1 online tutoring with Google Meet, OneNote and graphics tablet
</commit_message>
<xml_diff>
--- a/03_reflexao/Reflexao_IA.docx
+++ b/03_reflexao/Reflexao_IA.docx
@@ -52,10 +52,10 @@
         <w:rPr>
           <w:b/>
         </w:rPr>
-        <w:t>Disciplina:</w:t>
+        <w:t>Contexto Pedagógico:</w:t>
       </w:r>
       <w:r>
-        <w:t xml:space="preserve"> Física — 1º ano do Ensino Médio</w:t>
+        <w:t xml:space="preserve"> Aulas de reforço escolar individual (1 a 1), formato remoto síncrono via Google Meet, Microsoft OneNote e Mesa Digitalizadora</w:t>
       </w:r>
     </w:p>
     <w:p>
@@ -95,7 +95,7 @@
         <w:t>ChatGPT (OpenAI)</w:t>
       </w:r>
       <w:r>
-        <w:t>: Estruturação inicial do esqueleto do plano de aula, formulação de textos explicativos, elaboração de exercícios contextualizados e desenho de estratégias pedagógicas diferenciadas para os dois perfis de estudantes (padrão e TDAH).</w:t>
+        <w:t>: Estruturação do plano de aula individual de 50 minutos, elaboração dos materiais didáticos para a lousa do OneNote e desenho das estratégias de diferenciação para dois perfis de reforço particular: um aluno com assimilação rápida/autonomia e um aluno com TDAH (suporte intensivo a foco e organização visual).</w:t>
       </w:r>
     </w:p>
     <w:p>
@@ -110,7 +110,7 @@
         <w:t>Microsoft Copilot no Word</w:t>
       </w:r>
       <w:r>
-        <w:t>: Apoio na organização textual, formatação tipográfica, revisão de coesão e redação de roteiros complementares.</w:t>
+        <w:t>: Apoio na organização, revisão textual e formatação dos roteiros didáticos e materiais de apoio.</w:t>
       </w:r>
     </w:p>
     <w:p>
@@ -125,7 +125,22 @@
         <w:t>Microsoft Copilot no PowerPoint</w:t>
       </w:r>
       <w:r>
-        <w:t>: Apoio na concepção da estrutura visual dos slides, seleção de layout limpo e distribuição equilibrada de conteúdo por slide.</w:t>
+        <w:t>: Apoio na elaboração visual dos slides utilizados no compartilhamento de tela pelo Google Meet.</w:t>
+      </w:r>
+    </w:p>
+    <w:p>
+      <w:pPr>
+        <w:pStyle w:val="ListBullet"/>
+        <w:spacing w:before="20" w:after="40"/>
+      </w:pPr>
+      <w:r>
+        <w:rPr>
+          <w:b/>
+        </w:rPr>
+        <w:t>Microsoft OneNote &amp; Mesa Digitalizadora</w:t>
+      </w:r>
+      <w:r>
+        <w:t>: Ferramentas centrais de interação síncrona na aula de reforço, servindo como lousa digital para escrita manuscrita, diagramação de vetores em tempo real e código de cores para o aluno.</w:t>
       </w:r>
     </w:p>
     <w:p>
@@ -140,7 +155,7 @@
         <w:t>GitHub</w:t>
       </w:r>
       <w:r>
-        <w:t>: Hospedagem versionada, documentação transparente e disponibilização pública de todos os recursos didáticos e prompts geradores.</w:t>
+        <w:t>: Hospedagem versionada, organização transparente dos entregáveis e disponibilização da cadeia completa de prompts.</w:t>
       </w:r>
     </w:p>
     <w:p>
@@ -165,7 +180,7 @@
           <w:color w:val="2F5597"/>
           <w:sz w:val="28"/>
         </w:rPr>
-        <w:t>2. Como a IA Apoiou o Processo Docente</w:t>
+        <w:t>2. Como a IA Apoiou o Processo no Reforço Escolar Online</w:t>
       </w:r>
     </w:p>
     <w:p>
@@ -173,7 +188,7 @@
         <w:spacing w:before="40" w:after="80" w:line="276" w:lineRule="auto"/>
       </w:pPr>
       <w:r>
-        <w:t>A Inteligência Artificial atuou como um acelerador e copiloto de planejamento pedagógico. O ecossistema de ferramentas permitiu:</w:t>
+        <w:t>Na prática do reforço escolar particular (atendimento 1 a 1), o tempo do professor é disputado entre a preparação prévia e a interação em tempo real. A Inteligência Artificial atuou como um parceiro valioso:</w:t>
       </w:r>
     </w:p>
     <w:p>
@@ -185,10 +200,10 @@
         <w:rPr>
           <w:b/>
         </w:rPr>
-        <w:t>Agilidade no rascunho de materiais:</w:t>
+        <w:t>Adaptação Rápida aos Perfis dos Alunos:</w:t>
       </w:r>
       <w:r>
-        <w:t xml:space="preserve"> Redução expressiva no tempo gasto com digitação mecânica e formatação inicial de tabelas e listas.</w:t>
+        <w:t xml:space="preserve"> Permitiu desenhar com agilidade dois roteiros para a mesma aula — desafiando com profundidade o aluno padrão (que aprende com rapidez) e criando andaimes cognitivos em etapas curtas para o aluno com TDAH.</w:t>
       </w:r>
     </w:p>
     <w:p>
@@ -200,10 +215,10 @@
         <w:rPr>
           <w:b/>
         </w:rPr>
-        <w:t>Diferenciação inclusiva:</w:t>
+        <w:t>Planejamento da Lousa do OneNote:</w:t>
       </w:r>
       <w:r>
-        <w:t xml:space="preserve"> Criação rápida de duas abordagens para o mesmo conteúdo curricular — uma expositiva tradicional e outra com andaimes cognitivos (instruções particionadas, destaque visual de fórmulas e flexibilidade de formatos de resposta) para o estudante com TDAH.</w:t>
+        <w:t xml:space="preserve"> Auxiliou a estruturar os exemplos e a atividade prática (Casos A, B e C) em blocos limpos, fáceis de desenhar com a mesa digitalizadora sem poluição visual.</w:t>
       </w:r>
     </w:p>
     <w:p>
@@ -215,18 +230,10 @@
         <w:rPr>
           <w:b/>
         </w:rPr>
-        <w:t>Internacionalização imediata:</w:t>
+        <w:t>Agilidade na Internacionalização:</w:t>
       </w:r>
       <w:r>
-        <w:t xml:space="preserve"> Tradução e adequação pedagógica de um trecho conceitual para língua inglesa, permitindo práticas bilíngues ou acolhimento de estudantes com outra língua materna.</w:t>
-      </w:r>
-    </w:p>
-    <w:p>
-      <w:pPr>
-        <w:spacing w:before="40" w:after="80" w:line="276" w:lineRule="auto"/>
-      </w:pPr>
-      <w:r>
-        <w:t>A IA funciona como um catalisador de ideias, mas sua saída exige constante curadoria e julgamento profissional docente.</w:t>
+        <w:t xml:space="preserve"> Tradução rápida e precisa de trecho científico com notas didáticas para estudantes de língua materna estrangeira.</w:t>
       </w:r>
     </w:p>
     <w:p>
@@ -259,7 +266,7 @@
         <w:spacing w:before="40" w:after="80" w:line="276" w:lineRule="auto"/>
       </w:pPr>
       <w:r>
-        <w:t>Durante os testes e a produção dos conteúdos com os modelos de linguagem, foram observadas fragilidades conceituais recorrentes que exigiram intervenção humana direta:</w:t>
+        <w:t>Durante a interação com os modelos generativos, a intervenção humana do professor foi indispensável:</w:t>
       </w:r>
     </w:p>
     <w:p>
@@ -271,10 +278,10 @@
         <w:rPr>
           <w:b/>
         </w:rPr>
-        <w:t>Confusão física entre Quantidade de Movimento, Força e Frenagem:</w:t>
+        <w:t>Alucinação na Física (Momento vs. Força e Frenagem):</w:t>
       </w:r>
       <w:r>
-        <w:t xml:space="preserve"> Em versões iniciais, os modelos tenderam a associar diretamente que um corpo com maior quantidade de movimento "tem mais força" ou "demora necessariamente mais metros para parar". Isso constitui um erro conceitual clássico na Física. O plano e os exercícios foram rigorosamente revisados para deixar claro que p é uma medida do estado dinâmico (m · v), enquanto parar depende do impulso da força resultante (Δ p = \vec{F}_{\text{res}} Δ t) e da dissipação de energia cinética pelos freios e atrito.</w:t>
+        <w:t xml:space="preserve"> A IA gerava afirmações como *"o corpo com maior quantidade de movimento é mais difícil de frear e para depois"*. O professor corrigiu isso em todos os materiais, enfatizando que parar depende da força resultante, do tempo de atuação (impulso) e do atrito/freios, e não apenas de p.</w:t>
       </w:r>
     </w:p>
     <w:p>
@@ -286,19 +293,10 @@
         <w:rPr>
           <w:b/>
         </w:rPr>
-        <w:t>Risco de condescendência no perfil TDAH:</w:t>
+        <w:t>Adaptação para Aula Individual:</w:t>
       </w:r>
       <w:r>
-        <w:t xml:space="preserve"> A IA frequentemente reduzia a complexidade do conteúdo ou infantilizava a linguagem ao ser solicitada para adaptar para TDAH. Foi necessário calibrar o prompt para garantir que os </w:t>
-      </w:r>
-      <w:r>
-        <w:rPr>
-          <w:b/>
-        </w:rPr>
-        <w:t>objetivos de aprendizagem e o rigor físico permanecessem 100% idênticos</w:t>
-      </w:r>
-      <w:r>
-        <w:t>, alterando apenas a formatação, o particionamento das etapas e a redução de ruído visual.</w:t>
+        <w:t xml:space="preserve"> Os prompts iniciais de modelos de linguagem costumam sugerir dinâmicas em grupo ou em duplas (típicas de turmas escolares tradicionais). O professor reconfigurou todas as propostas para a realidade da mentoria individual (1 a 1) no Google Meet e OneNote.</w:t>
       </w:r>
     </w:p>
     <w:p>
@@ -310,10 +308,10 @@
         <w:rPr>
           <w:b/>
         </w:rPr>
-        <w:t>Referências bibliográficas imprecisas:</w:t>
+        <w:t>Risco de Subestimar o Aluno com TDAH:</w:t>
       </w:r>
       <w:r>
-        <w:t xml:space="preserve"> IAs generativas costumam alucinar páginas, anos ou edições de livros clássicos como *Halliday &amp; Resnick*. As referências foram sinalizadas para conferência física do exemplar específico adotado pela instituição.</w:t>
+        <w:t xml:space="preserve"> O modelo tendia a infantilizar a linguagem ou reduzir a cobrança matemática. A calibração docente garantiu que o nível de rigor científico permanecesse idêntico entre os alunos, alterando apenas a forma de apresentação (cores na lousa, passos particionados e timer).</w:t>
       </w:r>
     </w:p>
     <w:p>
@@ -343,10 +341,17 @@
     </w:p>
     <w:p>
       <w:pPr>
-        <w:spacing w:before="40" w:after="80" w:line="276" w:lineRule="auto"/>
+        <w:pStyle w:val="ListBullet"/>
+        <w:spacing w:before="20" w:after="40"/>
       </w:pPr>
       <w:r>
-        <w:t>Diante do material gerado, as seguintes diretrizes soberanas foram estabelecidas pelo docente:</w:t>
+        <w:rPr>
+          <w:b/>
+        </w:rPr>
+        <w:t>Uso Central do OneNote e da Mesa Digitalizadora:</w:t>
+      </w:r>
+      <w:r>
+        <w:t xml:space="preserve"> Toda a teoria e prática foram desenhadas para serem construídas "ao vivo" na lousa digital. O professor não apenas exibe slides estáticos, mas desenha os vetores e calcula passo a passo com o estudante.</w:t>
       </w:r>
     </w:p>
     <w:p>
@@ -358,10 +363,10 @@
         <w:rPr>
           <w:b/>
         </w:rPr>
-        <w:t>Manutenção estrita do rigor conceitual:</w:t>
+        <w:t>Atividade dos Casos A, B e C:</w:t>
       </w:r>
       <w:r>
-        <w:t xml:space="preserve"> Ambos os perfis realizam as mesmas contas, aprendem as mesmas grandezas e lidam com o caráter vetorial de p. A inclusão não diminui a expectativa de aprendizagem, mas viabiliza o acesso.</w:t>
+        <w:t xml:space="preserve"> Concebida como uma investigação dialogada de 7 minutos, na qual o estudante deduz as relações de proporcionalidade e desmistifica a frenagem antes de resolver os exercícios sozinhos.</w:t>
       </w:r>
     </w:p>
     <w:p>
@@ -373,25 +378,10 @@
         <w:rPr>
           <w:b/>
         </w:rPr>
-        <w:t>Atividade prática controlada:</w:t>
+        <w:t>Diferenciação Personalizada:</w:t>
       </w:r>
       <w:r>
-        <w:t xml:space="preserve"> Substituição de experimentos abertos sem controle de atrito por uma análise guiada com casos numéricos padronizados (Casos A, B e C), garantindo conclusões válidas em 7 minutos.</w:t>
-      </w:r>
-    </w:p>
-    <w:p>
-      <w:pPr>
-        <w:pStyle w:val="ListBullet"/>
-        <w:spacing w:before="20" w:after="40"/>
-      </w:pPr>
-      <w:r>
-        <w:rPr>
-          <w:b/>
-        </w:rPr>
-        <w:t>Transparência total:</w:t>
-      </w:r>
-      <w:r>
-        <w:t xml:space="preserve"> Marcação clara nos documentos de que houve assistência de IA, reafirmando que a responsabilidade e autoria pedagógica final pertencem ao professor Victor Palmeira.</w:t>
+        <w:t xml:space="preserve"> No reforço particular, o aluno padrão tem espaço para raciocínios mais profundos e autonomia, enquanto o aluno com TDAH recebe feedback imediato, cronômetro na tela para ancoragem temporal e suporte de cores na mesa digitalizadora.</w:t>
       </w:r>
     </w:p>
     <w:p>
@@ -424,16 +414,7 @@
         <w:spacing w:before="40" w:after="80" w:line="276" w:lineRule="auto"/>
       </w:pPr>
       <w:r>
-        <w:t xml:space="preserve">O uso de ecossistemas de Inteligência Artificial no ambiente educacional impõe rigoroso compromisso ético e conformidade legal com a </w:t>
-      </w:r>
-      <w:r>
-        <w:rPr>
-          <w:b/>
-        </w:rPr>
-        <w:t>Lei Geral de Proteção de Dados Pessoais (LGPD — Lei nº 13.709/2018)</w:t>
-      </w:r>
-      <w:r>
-        <w:t>:</w:t>
+        <w:t>Em atendimento particular individual, a privacidade do estudante é prioritária:</w:t>
       </w:r>
     </w:p>
     <w:p>
@@ -445,7 +426,7 @@
         <w:rPr>
           <w:b/>
         </w:rPr>
-        <w:t>Princípio da Privacidade e Minimização de Dados:</w:t>
+        <w:t>Conformidade com a LGPD (Lei nº 13.709/2018):</w:t>
       </w:r>
     </w:p>
     <w:p>
@@ -458,10 +439,10 @@
         <w:rPr>
           <w:b/>
         </w:rPr>
-        <w:t>Nenhum dado pessoal de alunos reais</w:t>
+        <w:t>Nenhum dado pessoal</w:t>
       </w:r>
       <w:r>
-        <w:t xml:space="preserve"> (como nomes, idades, endereços, fotos ou históricos escolares) foi inserido nos prompts das plataformas públicas de IA generativa (ChatGPT, Copilot ou similares).</w:t>
+        <w:t xml:space="preserve"> (nomes, idades, escolas de origem ou laudos diagnósticos de TDAH de alunos reais) foi digitado ou compartilhado com plataformas de IA generativa.</w:t>
       </w:r>
     </w:p>
     <w:p>
@@ -471,16 +452,16 @@
         <w:ind w:left="720"/>
       </w:pPr>
       <w:r>
-        <w:t xml:space="preserve">O trabalho com o estudante com TDAH baseou-se exclusivamente em uma </w:t>
+        <w:t xml:space="preserve">Os perfis utilizados no repositório são </w:t>
       </w:r>
       <w:r>
         <w:rPr>
           <w:b/>
         </w:rPr>
-        <w:t>persona pedagógica fictícia e generalizada</w:t>
+        <w:t>personas didáticas universais</w:t>
       </w:r>
       <w:r>
-        <w:t>, fundamentada em diretrizes de desenho universal para a aprendizagem (DUA) e neuroeducação, sem expor diagnósticos clínicos, relatórios psicopedagógicos ou laudos médicos individuais.</w:t>
+        <w:t xml:space="preserve"> baseadas nas diretrizes de Desenho Universal para a Aprendizagem (DUA).</w:t>
       </w:r>
     </w:p>
     <w:p>
@@ -502,39 +483,7 @@
         <w:ind w:left="720"/>
       </w:pPr>
       <w:r>
-        <w:t>A IA generativa não é autora e não detém direitos intelectuais ou deveres legais. O professor Victor Palmeira é o autor do plano e dos materiais, tendo curado, editado, corrigido e validado cada linha de texto e equação.</w:t>
-      </w:r>
-    </w:p>
-    <w:p>
-      <w:pPr>
-        <w:pStyle w:val="ListBullet"/>
-        <w:spacing w:before="20" w:after="40"/>
-        <w:ind w:left="720"/>
-      </w:pPr>
-      <w:r>
-        <w:t>O uso das ferramentas é explicitamente divulgado, promovendo uma cultura de integridade acadêmica e letramento digital ético diante dos alunos e da comunidade escolar.</w:t>
-      </w:r>
-    </w:p>
-    <w:p>
-      <w:pPr>
-        <w:pStyle w:val="ListNumber"/>
-        <w:spacing w:before="20" w:after="40"/>
-      </w:pPr>
-      <w:r>
-        <w:rPr>
-          <w:b/>
-        </w:rPr>
-        <w:t>Segurança e Diretrizes Institucionais:</w:t>
-      </w:r>
-    </w:p>
-    <w:p>
-      <w:pPr>
-        <w:pStyle w:val="ListBullet"/>
-        <w:spacing w:before="20" w:after="40"/>
-        <w:ind w:left="720"/>
-      </w:pPr>
-      <w:r>
-        <w:t>O projeto adota a premissa de que qualquer interação com IAs na escola deve respeitar a proteção de crianças e adolescentes (Art. 14 da LGPD), exigindo ambientes fechados e termos de privacidade estritos caso ferramentas inteligentes venham a ser manipuladas diretamente pelos estudantes.</w:t>
+        <w:t>A autoria do plano e dos materiais é integralmente do professor Victor Palmeira, que fez a validação pedagógica e física de cada item antes de aplicar na aula de reforço.</w:t>
       </w:r>
     </w:p>
     <w:p>
@@ -567,34 +516,7 @@
         <w:spacing w:before="40" w:after="80" w:line="276" w:lineRule="auto"/>
       </w:pPr>
       <w:r>
-        <w:t>A experiência consolidou o entendimento de que a inteligência artificial é uma valiosa aliada do planejamento docente quando ancorada em:</w:t>
-      </w:r>
-    </w:p>
-    <w:p>
-      <w:pPr>
-        <w:pStyle w:val="ListBullet"/>
-        <w:spacing w:before="20" w:after="40"/>
-      </w:pPr>
-      <w:r>
-        <w:t>Prompts com contexto pedagógico explícito, papéis bem delineados e restrições claras;</w:t>
-      </w:r>
-    </w:p>
-    <w:p>
-      <w:pPr>
-        <w:pStyle w:val="ListBullet"/>
-        <w:spacing w:before="20" w:after="40"/>
-      </w:pPr>
-      <w:r>
-        <w:t>Postura crítica do docente, atuando como árbitro epistemológico do conhecimento físico;</w:t>
-      </w:r>
-    </w:p>
-    <w:p>
-      <w:pPr>
-        <w:pStyle w:val="ListBullet"/>
-        <w:spacing w:before="20" w:after="40"/>
-      </w:pPr>
-      <w:r>
-        <w:t>Compromisso inegociável com a ética e a privacidade dos estudantes.</w:t>
+        <w:t>A experiência demonstrou que a IA generativa é especialmente poderosa no reforço escolar 1 a 1, pois permite ao professor customizar materiais com a velocidade que o atendimento individualizado exige.</w:t>
       </w:r>
     </w:p>
     <w:p>
@@ -614,7 +536,7 @@
         <w:spacing w:before="20" w:after="40"/>
       </w:pPr>
       <w:r>
-        <w:t>Ministrar a aula de 50 minutos na turma de 1º ano e avaliar a recepção do cronômetro visual e dos exercícios em etapas pelo estudante com TDAH;</w:t>
+        <w:t>Salvar as seções da lousa do OneNote após cada aula em formato PDF para enviar como material de revisão para os estudantes;</w:t>
       </w:r>
     </w:p>
     <w:p>
@@ -623,7 +545,7 @@
         <w:spacing w:before="20" w:after="40"/>
       </w:pPr>
       <w:r>
-        <w:t>Avaliar a necessidade de estender a internacionalização para o espanhol (segundo idioma de maior acolhimento em escolas brasileiras);</w:t>
+        <w:t>Continuar refinando o uso do timer visual compartilhado no Google Meet para alunos que necessitam de suporte na autorregulação do foco;</w:t>
       </w:r>
     </w:p>
     <w:p>
@@ -632,7 +554,7 @@
         <w:spacing w:before="20" w:after="40"/>
       </w:pPr>
       <w:r>
-        <w:t>Compartilhar o repositório como modelo de transparência e conformidade pedagógica com a comunidade escolar.</w:t>
+        <w:t>Expandir a biblioteca de casos do OneNote para as próximas aulas (impulso, colisões e conservação da quantidade de movimento).</w:t>
       </w:r>
     </w:p>
     <w:sectPr>

</xml_diff>